<commit_message>
court(prsupreme): answering brief, brief on the merits and motion for reconsideration on the shared document model, legal paper, latex and docx generated (fb-595.54.73)
The INPUTs' straight double quotes curled as the pandoc engines read them (typst's nesting set some as opening),
the motion's lettered paragraphs escaped (pandoc renumbered them), its two adjacent note marks joined; the motion
has no índices (TSPR R 45) and its page limit is Rule 45(b)'s ten pages.

Co-Authored-By: Claude Opus 5.5 <noreply@anthropic.com>
</commit_message>
<xml_diff>
--- a/courts/first-circuit/puerto-rico/state/supreme-court/amicus-brief/usage/OUTPUT-amicus-brief.docx
+++ b/courts/first-circuit/puerto-rico/state/supreme-court/amicus-brief/usage/OUTPUT-amicus-brief.docx
@@ -1957,28 +1957,7 @@
         <w:pStyle w:val="BodyText"/>
       </w:pPr>
       <w:r>
-        <w:t xml:space="preserve">COMPARECEN Centro Margarita, Inc., Pequeño Campeón de Jesús, Inc. y Alianza de Autismo de Puerto Rico (en adelante, conjuntamente, las</w:t>
-      </w:r>
-      <w:r>
-        <w:t xml:space="preserve"> </w:t>
-      </w:r>
-      <w:r>
-        <w:t xml:space="preserve">“entidades comparecientes”</w:t>
-      </w:r>
-      <w:r>
-        <w:t xml:space="preserve"> </w:t>
-      </w:r>
-      <w:r>
-        <w:t xml:space="preserve">o los</w:t>
-      </w:r>
-      <w:r>
-        <w:t xml:space="preserve"> </w:t>
-      </w:r>
-      <w:r>
-        <w:t xml:space="preserve">“Amici Curiae”</w:t>
-      </w:r>
-      <w:r>
-        <w:t xml:space="preserve">), por conducto de la representación legal que suscribe, y muy respetuosamente EXPONEN, ALEGAN y SOLICITAN:</w:t>
+        <w:t xml:space="preserve">COMPARECEN Centro Margarita, Inc., Pequeño Campeón de Jesús, Inc. y Alianza de Autismo de Puerto Rico (en adelante, conjuntamente, las “entidades comparecientes” o los “Amici Curiae”), por conducto de la representación legal que suscribe, y muy respetuosamente EXPONEN, ALEGAN y SOLICITAN:</w:t>
       </w:r>
     </w:p>
     <w:p>
@@ -2079,16 +2058,7 @@
         <w:pStyle w:val="BodyText"/>
       </w:pPr>
       <w:r>
-        <w:t xml:space="preserve">En la experiencia institucional de las comparecientes, este tipo de interrupción puede propiciar regresión funcional o pérdida temporal de destrezas previamente adquiridas. Cuando un paciente con diversidad funcional pierde abruptamente un proveedor con quien mantiene una relación terapéutica previamente establecida, pueden observarse: reducción de participación en terapia; pérdida temporal de estrategias aprendidas; resistencia al nuevo proveedor; aumento de conductas evitativas; necesidad de repetir etapas de evaluación y creación de confianza. No significa que el paciente</w:t>
-      </w:r>
-      <w:r>
-        <w:t xml:space="preserve"> </w:t>
-      </w:r>
-      <w:r>
-        <w:t xml:space="preserve">“pierda todo progreso”</w:t>
-      </w:r>
-      <w:r>
-        <w:t xml:space="preserve">, sino que puede requerir un periodo de readaptación. En términos clínicos, el nuevo profesional no recibe solamente un expediente: debe reconstruir una relación funcional, la cual depende en gran medida del paciente.</w:t>
+        <w:t xml:space="preserve">En la experiencia institucional de las comparecientes, este tipo de interrupción puede propiciar regresión funcional o pérdida temporal de destrezas previamente adquiridas. Cuando un paciente con diversidad funcional pierde abruptamente un proveedor con quien mantiene una relación terapéutica previamente establecida, pueden observarse: reducción de participación en terapia; pérdida temporal de estrategias aprendidas; resistencia al nuevo proveedor; aumento de conductas evitativas; necesidad de repetir etapas de evaluación y creación de confianza. No significa que el paciente “pierda todo progreso”, sino que puede requerir un periodo de readaptación. En términos clínicos, el nuevo profesional no recibe solamente un expediente: debe reconstruir una relación funcional, la cual depende en gran medida del paciente.</w:t>
       </w:r>
     </w:p>
     <w:p>
@@ -2135,19 +2105,7 @@
         <w:pStyle w:val="BodyText"/>
       </w:pPr>
       <w:r>
-        <w:t xml:space="preserve">La razón no es simplemente</w:t>
-      </w:r>
-      <w:r>
-        <w:t xml:space="preserve"> </w:t>
-      </w:r>
-      <w:r>
-        <w:t xml:space="preserve">“extrañar”</w:t>
-      </w:r>
-      <w:r>
-        <w:t xml:space="preserve"> </w:t>
-      </w:r>
-      <w:r>
-        <w:t xml:space="preserve">al psicólogo; es que la relación funciona como un marco estable donde el paciente anticipa respuestas, expectativas y estrategias, que no son fáciles de sustituir, o más bien, se tiene que volver a crear con el próximo terapeuta.</w:t>
+        <w:t xml:space="preserve">La razón no es simplemente “extrañar” al psicólogo; es que la relación funciona como un marco estable donde el paciente anticipa respuestas, expectativas y estrategias, que no son fáciles de sustituir, o más bien, se tiene que volver a crear con el próximo terapeuta.</w:t>
       </w:r>
     </w:p>
     <w:p>
@@ -2595,16 +2553,7 @@
         <w:pStyle w:val="BodyText"/>
       </w:pPr>
       <w:r>
-        <w:t xml:space="preserve">La Opinión emitida por este Honorable Tribunal reconoce expresamente que la validez y aplicabilidad de las cláusulas de no competencia requieren un análisis de razonabilidad</w:t>
-      </w:r>
-      <w:r>
-        <w:t xml:space="preserve"> </w:t>
-      </w:r>
-      <w:r>
-        <w:t xml:space="preserve">“conforme a las circunstancias particulares de cada caso”</w:t>
-      </w:r>
-      <w:r>
-        <w:t xml:space="preserve">. Precisamente por ello, las comparecientes entienden respetuosamente que la controversia no podía ser adjudicada de forma dispositiva sin el correspondiente desarrollo probatorio ante el Tribunal de Primera Instancia.</w:t>
+        <w:t xml:space="preserve">La Opinión emitida por este Honorable Tribunal reconoce expresamente que la validez y aplicabilidad de las cláusulas de no competencia requieren un análisis de razonabilidad “conforme a las circunstancias particulares de cada caso”. Precisamente por ello, las comparecientes entienden respetuosamente que la controversia no podía ser adjudicada de forma dispositiva sin el correspondiente desarrollo probatorio ante el Tribunal de Primera Instancia.</w:t>
       </w:r>
     </w:p>
     <w:p>
@@ -2701,16 +2650,7 @@
         <w:t xml:space="preserve">Young &amp; Co. v. Vega III</w:t>
       </w:r>
       <w:r>
-        <w:t xml:space="preserve">, supra, el Tribunal Supremo de Puerto Rico estableció que toda cláusula de no competencia debe evaluarse conforme a un criterio de razonabilidad que incluya, entre otros factores, si la restricción resulta</w:t>
-      </w:r>
-      <w:r>
-        <w:t xml:space="preserve"> </w:t>
-      </w:r>
-      <w:r>
-        <w:t xml:space="preserve">“excesivamente perjudicial al interés público”</w:t>
-      </w:r>
-      <w:r>
-        <w:t xml:space="preserve">. Íd. Ese análisis necesariamente requiere evaluar circunstancias reales relacionadas con la disponibilidad de servicios, acceso a profesionales, necesidades de la población impactada y consecuencias prácticas de la restricción contractual.</w:t>
+        <w:t xml:space="preserve">, supra, el Tribunal Supremo de Puerto Rico estableció que toda cláusula de no competencia debe evaluarse conforme a un criterio de razonabilidad que incluya, entre otros factores, si la restricción resulta “excesivamente perjudicial al interés público”. Íd. Ese análisis necesariamente requiere evaluar circunstancias reales relacionadas con la disponibilidad de servicios, acceso a profesionales, necesidades de la población impactada y consecuencias prácticas de la restricción contractual.</w:t>
       </w:r>
     </w:p>
     <w:p>
@@ -2749,45 +2689,15 @@
         <w:pStyle w:val="BodyText"/>
       </w:pPr>
       <w:r>
-        <w:t xml:space="preserve">La propia jurisprudencia federal ha reconocido que la validez de las cláusulas de no competencia</w:t>
-      </w:r>
-      <w:r>
-        <w:t xml:space="preserve"> </w:t>
-      </w:r>
-      <w:r>
-        <w:t xml:space="preserve">“may depend on the interplay of their terms with the factual variables within which they operate”</w:t>
-      </w:r>
-      <w:r>
-        <w:t xml:space="preserve">, por lo que adjudicar dichas controversias en etapa dispositiva resulta improcedente cuando ello requiere resolver controversias fácticas subyacentes. Novis PR, LLC v. Gadal Laboratories, Inc., Not Reported in Fed. Supp. (2023).</w:t>
-      </w:r>
-    </w:p>
-    <w:p>
-      <w:pPr>
-        <w:pStyle w:val="BodyText"/>
-      </w:pPr>
-      <w:r>
-        <w:t xml:space="preserve">De igual forma, el Primer Circuito ha reconocido que la razonabilidad de un pacto restrictivo constituye una cuestión mixta de derecho y hechos, cuya adjudicación depende del examen de</w:t>
-      </w:r>
-      <w:r>
-        <w:t xml:space="preserve"> </w:t>
-      </w:r>
-      <w:r>
-        <w:t xml:space="preserve">“all relevant circumstances”</w:t>
-      </w:r>
-      <w:r>
-        <w:t xml:space="preserve">. Ferrofluidics Corp. v. Advanced Vacuum Components, Inc., 968 F.2d 1463 (1st Cir. 1992). La jurisprudencia federal también ha reiterado que la razonabilidad de estos acuerdos constituye una controversia inherentemente</w:t>
-      </w:r>
-      <w:r>
-        <w:t xml:space="preserve"> </w:t>
-      </w:r>
-      <w:r>
-        <w:t xml:space="preserve">“fact-intensive”</w:t>
-      </w:r>
-      <w:r>
-        <w:t xml:space="preserve"> </w:t>
-      </w:r>
-      <w:r>
-        <w:t xml:space="preserve">que no debe resolverse en los alegatos. Véanse Core and Main, LP v. McCabe, 62 F.4th 414 (8th Cir. 2023); Dodge v. Mevion Medical Systems, Inc., 575 F.Supp.3d 236 (D. Mass. 2021); Hadeed v. Advanced Vascular Resources of Johnstown, LLC, Not Reported in Fed. Supp. (2017).</w:t>
+        <w:t xml:space="preserve">La propia jurisprudencia federal ha reconocido que la validez de las cláusulas de no competencia “may depend on the interplay of their terms with the factual variables within which they operate”, por lo que adjudicar dichas controversias en etapa dispositiva resulta improcedente cuando ello requiere resolver controversias fácticas subyacentes. Novis PR, LLC v. Gadal Laboratories, Inc., Not Reported in Fed. Supp. (2023).</w:t>
+      </w:r>
+    </w:p>
+    <w:p>
+      <w:pPr>
+        <w:pStyle w:val="BodyText"/>
+      </w:pPr>
+      <w:r>
+        <w:t xml:space="preserve">De igual forma, el Primer Circuito ha reconocido que la razonabilidad de un pacto restrictivo constituye una cuestión mixta de derecho y hechos, cuya adjudicación depende del examen de “all relevant circumstances”. Ferrofluidics Corp. v. Advanced Vacuum Components, Inc., 968 F.2d 1463 (1st Cir. 1992). La jurisprudencia federal también ha reiterado que la razonabilidad de estos acuerdos constituye una controversia inherentemente “fact-intensive” que no debe resolverse en los alegatos. Véanse Core and Main, LP v. McCabe, 62 F.4th 414 (8th Cir. 2023); Dodge v. Mevion Medical Systems, Inc., 575 F.Supp.3d 236 (D. Mass. 2021); Hadeed v. Advanced Vascular Resources of Johnstown, LLC, Not Reported in Fed. Supp. (2017).</w:t>
       </w:r>
     </w:p>
     <w:p>
@@ -2851,19 +2761,7 @@
         <w:pStyle w:val="BodyTextNote"/>
       </w:pPr>
       <w:r>
-        <w:t xml:space="preserve">Más aún, la legislación federal aplicable y la jurisprudencia relacionada con IDEA reconocen consistentemente la importancia de continuidad y estabilidad en la prestación de servicios relacionados dirigidos a menores con discapacidades y necesidades especiales. Íd. En particular, la IDEA reconoce como</w:t>
-      </w:r>
-      <w:r>
-        <w:t xml:space="preserve"> </w:t>
-      </w:r>
-      <w:r>
-        <w:t xml:space="preserve">“related services”</w:t>
-      </w:r>
-      <w:r>
-        <w:t xml:space="preserve"> </w:t>
-      </w:r>
-      <w:r>
-        <w:t xml:space="preserve">diversos servicios psicológicos, terapéuticos y de apoyo necesarios para asistir al menor con discapacidad a beneficiarse efectivamente de una educación pública apropiada y gratuita (Free Appropriate Public Education o FAPE, por sus siglas en inglés), incluyendo servicios psicológicos, terapia ocupacional, terapia física, terapia del habla y lenguaje, consejería y otros servicios especializados.</w:t>
+        <w:t xml:space="preserve">Más aún, la legislación federal aplicable y la jurisprudencia relacionada con IDEA reconocen consistentemente la importancia de continuidad y estabilidad en la prestación de servicios relacionados dirigidos a menores con discapacidades y necesidades especiales. Íd. En particular, la IDEA reconoce como “related services” diversos servicios psicológicos, terapéuticos y de apoyo necesarios para asistir al menor con discapacidad a beneficiarse efectivamente de una educación pública apropiada y gratuita (Free Appropriate Public Education o FAPE, por sus siglas en inglés), incluyendo servicios psicológicos, terapia ocupacional, terapia física, terapia del habla y lenguaje, consejería y otros servicios especializados.</w:t>
       </w:r>
       <w:r>
         <w:t xml:space="preserve"> </w:t>
@@ -3136,16 +3034,7 @@
         <w:pStyle w:val="BodyText"/>
       </w:pPr>
       <w:r>
-        <w:t xml:space="preserve">La propia Opinión reconoce correctamente que la cesión de contrato constituye una figura distinta a la cesión de créditos y que implica la transmisión de una relación obligacional compleja</w:t>
-      </w:r>
-      <w:r>
-        <w:t xml:space="preserve"> </w:t>
-      </w:r>
-      <w:r>
-        <w:t xml:space="preserve">“como un todo”</w:t>
-      </w:r>
-      <w:r>
-        <w:t xml:space="preserve">. Precisamente por ello, la doctrina civilista históricamente ha reconocido que la cesión contractual requiere particular atención cuando la identidad del cocontratante constituye un elemento significativo de la relación jurídica. Véanse</w:t>
+        <w:t xml:space="preserve">La propia Opinión reconoce correctamente que la cesión de contrato constituye una figura distinta a la cesión de créditos y que implica la transmisión de una relación obligacional compleja “como un todo”. Precisamente por ello, la doctrina civilista históricamente ha reconocido que la cesión contractual requiere particular atención cuando la identidad del cocontratante constituye un elemento significativo de la relación jurídica. Véanse</w:t>
       </w:r>
       <w:r>
         <w:t xml:space="preserve"> </w:t>
@@ -3453,28 +3342,7 @@
         <w:pStyle w:val="BodyText"/>
       </w:pPr>
       <w:r>
-        <w:t xml:space="preserve">Más aún, la rigurosidad del consentimiento debe intensificarse, no flexibilizarse, cuando están en juego restricciones relacionadas con libertad ocupacional. Tanto Puerto Rico como múltiples jurisdicciones estadounidenses han reconocido históricamente que las cláusulas restrictivas merecen escrutinio reforzado precisamente porque afectan no solamente intereses contractuales privados, sino también el acceso público a servicios profesionales y la capacidad del individuo de ejercer su profesión. Véanse Íd (reconociendo que cláusulas excesivas violan el orden público al restringir injustificadamente</w:t>
-      </w:r>
-      <w:r>
-        <w:t xml:space="preserve"> </w:t>
-      </w:r>
-      <w:r>
-        <w:t xml:space="preserve">“la libertad del empleado para trabajar”</w:t>
-      </w:r>
-      <w:r>
-        <w:t xml:space="preserve"> </w:t>
-      </w:r>
-      <w:r>
-        <w:t xml:space="preserve">y</w:t>
-      </w:r>
-      <w:r>
-        <w:t xml:space="preserve"> </w:t>
-      </w:r>
-      <w:r>
-        <w:t xml:space="preserve">“la libertad del público para seleccionar profesionales”</w:t>
-      </w:r>
-      <w:r>
-        <w:t xml:space="preserve">);</w:t>
+        <w:t xml:space="preserve">Más aún, la rigurosidad del consentimiento debe intensificarse, no flexibilizarse, cuando están en juego restricciones relacionadas con libertad ocupacional. Tanto Puerto Rico como múltiples jurisdicciones estadounidenses han reconocido históricamente que las cláusulas restrictivas merecen escrutinio reforzado precisamente porque afectan no solamente intereses contractuales privados, sino también el acceso público a servicios profesionales y la capacidad del individuo de ejercer su profesión. Véanse Íd (reconociendo que cláusulas excesivas violan el orden público al restringir injustificadamente “la libertad del empleado para trabajar” y “la libertad del público para seleccionar profesionales”);</w:t>
       </w:r>
       <w:r>
         <w:t xml:space="preserve"> </w:t>
@@ -4292,7 +4160,7 @@
     </w:p>
     <w:p>
       <w:pPr>
-        <w:pStyle w:val="BodyText"/>
+        <w:pStyle w:val="BodyTextKeep"/>
       </w:pPr>
       <w:r>
         <w:t xml:space="preserve">En San Juan, Puerto Rico, hoy, 12 de junio de 2026.</w:t>
@@ -4300,6 +4168,8 @@
     </w:p>
     <w:p>
       <w:pPr>
+        <w:keepNext/>
+        <w:keepLines/>
         <w:spacing w:before="0" w:after="0" w:line="288" w:lineRule="exact"/>
       </w:pPr>
     </w:p>
@@ -4810,19 +4680,7 @@
         <w:t xml:space="preserve"> </w:t>
       </w:r>
       <w:r>
-        <w:t xml:space="preserve">20 U.S.C. § 1401(26) - Related services (A) In general: The term</w:t>
-      </w:r>
-      <w:r>
-        <w:t xml:space="preserve"> </w:t>
-      </w:r>
-      <w:r>
-        <w:t xml:space="preserve">“related services”</w:t>
-      </w:r>
-      <w:r>
-        <w:t xml:space="preserve"> </w:t>
-      </w:r>
-      <w:r>
-        <w:t xml:space="preserve">means transportation, and such developmental, corrective, and other supportive services (including speech-language pathology and audiology services, interpreting services, psychological services, physical and occupational therapy, recreation, including therapeutic recreation, social work services, school nurse services designed to enable a child with a disability to receive a free appropriate public education as described in the individualized education program of the child, counseling services, including rehabilitation counseling, orientation and mobility services, and medical services, except that such medical services shall be for diagnostic and evaluation purposes only) as may be required to assist a child with a disability to benefit from special education, and includes the early identification and assessment of disabling conditions in children.</w:t>
+        <w:t xml:space="preserve">20 U.S.C. § 1401(26) - Related services (A) In general: The term “related services” means transportation, and such developmental, corrective, and other supportive services (including speech-language pathology and audiology services, interpreting services, psychological services, physical and occupational therapy, recreation, including therapeutic recreation, social work services, school nurse services designed to enable a child with a disability to receive a free appropriate public education as described in the individualized education program of the child, counseling services, including rehabilitation counseling, orientation and mobility services, and medical services, except that such medical services shall be for diagnostic and evaluation purposes only) as may be required to assist a child with a disability to benefit from special education, and includes the early identification and assessment of disabling conditions in children.</w:t>
       </w:r>
     </w:p>
   </w:footnote>
@@ -5761,6 +5619,15 @@
     <w:pPr>
       <w:spacing w:before="0" w:after="0" w:line="276" w:lineRule="exact"/>
       <w:ind w:firstLine="0"/>
+    </w:pPr>
+  </w:style>
+  <w:style w:type="paragraph" w:customStyle="1" w:styleId="BodyTextKeep">
+    <w:name w:val="Body Text Keep"/>
+    <w:basedOn w:val="BodyText"/>
+    <w:qFormat/>
+    <w:pPr>
+      <w:keepNext/>
+      <w:keepLines/>
     </w:pPr>
   </w:style>
   <w:style w:type="paragraph" w:customStyle="1" w:styleId="XdList1">

</xml_diff>